<commit_message>
TI.1.3: completar diagramas y documentación
</commit_message>
<xml_diff>
--- a/P1/TI.1.3. PAO202651_RESTFUL_JAVA_SINBDD_NRC_36883_GR07/01. UML/02. ECUD/ECUD_TI_1.3_GR07.docx
+++ b/P1/TI.1.3. PAO202651_RESTFUL_JAVA_SINBDD_NRC_36883_GR07/01. UML/02. ECUD/ECUD_TI_1.3_GR07.docx
@@ -1162,6 +1162,75 @@
       </w:tr>
     </w:tbl>
     <w:p/>
+    <w:p>
+      <w:pPr>
+        <w:pStyle w:val="Heading1"/>
+        <w:pageBreakBefore/>
+      </w:pPr>
+      <w:r>
+        <w:t>Diagrama de casos de uso</w:t>
+      </w:r>
+    </w:p>
+    <w:p>
+      <w:pPr>
+        <w:jc w:val="center"/>
+      </w:pPr>
+      <w:r>
+        <w:drawing>
+          <wp:inline xmlns:a="http://schemas.openxmlformats.org/drawingml/2006/main" xmlns:pic="http://schemas.openxmlformats.org/drawingml/2006/picture">
+            <wp:extent cx="5029200" cy="4185449"/>
+            <wp:docPr id="2" name="Picture 2"/>
+            <wp:cNvGraphicFramePr>
+              <a:graphicFrameLocks noChangeAspect="1"/>
+            </wp:cNvGraphicFramePr>
+            <a:graphic>
+              <a:graphicData uri="http://schemas.openxmlformats.org/drawingml/2006/picture">
+                <pic:pic>
+                  <pic:nvPicPr>
+                    <pic:cNvPr id="0" name="DiagramaCasosUso_TI13.png"/>
+                    <pic:cNvPicPr/>
+                  </pic:nvPicPr>
+                  <pic:blipFill>
+                    <a:blip r:embed="rId12"/>
+                    <a:stretch>
+                      <a:fillRect/>
+                    </a:stretch>
+                  </pic:blipFill>
+                  <pic:spPr>
+                    <a:xfrm>
+                      <a:off x="0" y="0"/>
+                      <a:ext cx="5029200" cy="4185449"/>
+                    </a:xfrm>
+                    <a:prstGeom prst="rect"/>
+                  </pic:spPr>
+                </pic:pic>
+              </a:graphicData>
+            </a:graphic>
+          </wp:inline>
+        </w:drawing>
+      </w:r>
+    </w:p>
+    <w:p>
+      <w:pPr>
+        <w:pStyle w:val="Caption"/>
+        <w:jc w:val="center"/>
+      </w:pPr>
+      <w:r>
+        <w:t>Ilustraci?n 1. Diagrama de casos de uso de la API REST</w:t>
+      </w:r>
+    </w:p>
+    <w:p>
+      <w:pPr>
+        <w:jc w:val="center"/>
+      </w:pPr>
+      <w:r>
+        <w:rPr>
+          <w:rFonts w:ascii="Consolas" w:hAnsi="Consolas"/>
+          <w:sz w:val="16"/>
+        </w:rPr>
+        <w:t>Modelo editable: 01. UML/03. DIAGRAMAS/01_CASOS_USO/DiagramaCasosUso_TI13.oom</w:t>
+      </w:r>
+    </w:p>
     <w:sectPr>
       <w:headerReference w:type="default" r:id="rId9"/>
       <w:footerReference w:type="default" r:id="rId10"/>

</xml_diff>